<commit_message>
Se mejora el popup de previsualizacion de venta de REnta Fija
</commit_message>
<xml_diff>
--- a/documentacion/VentaInversionPlazoFijo.docx
+++ b/documentacion/VentaInversionPlazoFijo.docx
@@ -3669,16 +3669,278 @@
     </w:p>
     <w:p>
       <w:r>
-        <w:t xml:space="preserve">La tabla de amortización asociada a la parte remanente inicia a </w:t>
-      </w:r>
-      <w:r>
-        <w:t>partir de la primera cuota de la inversión original</w:t>
-      </w:r>
-      <w:r>
-        <w:t xml:space="preserve"> y finaliza a la fecha de vencimiento de la inversión, es decir en la fecha de la última cuota de la inversión original. </w:t>
-      </w:r>
-      <w:r>
-        <w:t>Los estados de las cuotas serán iguales a los de la tabla de amortización original.</w:t>
+        <w:t>La tabla de amortización asociada a la parte remanente inicia a partir de la primera cuota de la inversión original y finaliza a la fecha de vencimiento de la inversión, es decir en la fecha de la última cuota de la inversión original. Los estados de las cuotas serán iguales a los de la tabla de amortización original.</w:t>
+      </w:r>
+    </w:p>
+    <w:p>
+      <w:r>
+        <w:t>= ===================</w:t>
+      </w:r>
+    </w:p>
+    <w:p/>
+    <w:p>
+      <w:r>
+        <w:t>He revisado la lógica de amortización para ventas parciales y considero que debemos realizar un ajuste para mejorar la trazabilidad histórica.</w:t>
+      </w:r>
+    </w:p>
+    <w:p>
+      <w:r>
+        <w:t>Actualmente se están reutilizando parcialmente las amortizaciones originales para la inversión remanente. Prefiero un enfoque diferente.</w:t>
+      </w:r>
+    </w:p>
+    <w:p>
+      <w:r>
+        <w:t>Nueva regla de negocio:</w:t>
+      </w:r>
+    </w:p>
+    <w:p>
+      <w:pPr>
+        <w:numPr>
+          <w:ilvl w:val="0"/>
+          <w:numId w:val="24"/>
+        </w:numPr>
+      </w:pPr>
+      <w:r>
+        <w:t>Todas las cuotas de la tabla de amortización original deben mantenerse en la base de datos.</w:t>
+      </w:r>
+    </w:p>
+    <w:p>
+      <w:pPr>
+        <w:numPr>
+          <w:ilvl w:val="0"/>
+          <w:numId w:val="24"/>
+        </w:numPr>
+      </w:pPr>
+      <w:r>
+        <w:t>Todas las cuotas de la amortización original deben actualizar su campo:</w:t>
+      </w:r>
+    </w:p>
+    <w:p>
+      <w:proofErr w:type="spellStart"/>
+      <w:r>
+        <w:t>id_estado_amortizacion</w:t>
+      </w:r>
+      <w:proofErr w:type="spellEnd"/>
+      <w:r>
+        <w:t xml:space="preserve"> = 137</w:t>
+      </w:r>
+    </w:p>
+    <w:p>
+      <w:r>
+        <w:t>donde 137 corresponde a:</w:t>
+      </w:r>
+    </w:p>
+    <w:p>
+      <w:r>
+        <w:t>"Anulada por venta parcial"</w:t>
+      </w:r>
+    </w:p>
+    <w:p>
+      <w:pPr>
+        <w:numPr>
+          <w:ilvl w:val="0"/>
+          <w:numId w:val="24"/>
+        </w:numPr>
+      </w:pPr>
+      <w:r>
+        <w:t>Se deben generar dos nuevas tablas de amortización prorrateadas:</w:t>
+      </w:r>
+    </w:p>
+    <w:p>
+      <w:pPr>
+        <w:numPr>
+          <w:ilvl w:val="1"/>
+          <w:numId w:val="24"/>
+        </w:numPr>
+      </w:pPr>
+      <w:r>
+        <w:t>Amortización de la Parte Vendida</w:t>
+      </w:r>
+    </w:p>
+    <w:p>
+      <w:pPr>
+        <w:numPr>
+          <w:ilvl w:val="1"/>
+          <w:numId w:val="24"/>
+        </w:numPr>
+      </w:pPr>
+      <w:r>
+        <w:t>Amortización de la Parte Remanente</w:t>
+      </w:r>
+    </w:p>
+    <w:p>
+      <w:pPr>
+        <w:numPr>
+          <w:ilvl w:val="0"/>
+          <w:numId w:val="24"/>
+        </w:numPr>
+      </w:pPr>
+      <w:r>
+        <w:t>Amortización de la Parte Vendida</w:t>
+      </w:r>
+    </w:p>
+    <w:p>
+      <w:pPr>
+        <w:numPr>
+          <w:ilvl w:val="1"/>
+          <w:numId w:val="24"/>
+        </w:numPr>
+      </w:pPr>
+      <w:r>
+        <w:t>Inicia desde la primera cuota de la inversión original.</w:t>
+      </w:r>
+    </w:p>
+    <w:p>
+      <w:pPr>
+        <w:numPr>
+          <w:ilvl w:val="1"/>
+          <w:numId w:val="24"/>
+        </w:numPr>
+      </w:pPr>
+      <w:r>
+        <w:t xml:space="preserve">Finaliza en la última cuota cuya </w:t>
+      </w:r>
+      <w:proofErr w:type="spellStart"/>
+      <w:r>
+        <w:t>fecha_pago</w:t>
+      </w:r>
+      <w:proofErr w:type="spellEnd"/>
+      <w:r>
+        <w:t xml:space="preserve"> sea menor o igual a la </w:t>
+      </w:r>
+      <w:proofErr w:type="spellStart"/>
+      <w:r>
+        <w:t>fecha_venta</w:t>
+      </w:r>
+      <w:proofErr w:type="spellEnd"/>
+      <w:r>
+        <w:t>.</w:t>
+      </w:r>
+    </w:p>
+    <w:p>
+      <w:pPr>
+        <w:numPr>
+          <w:ilvl w:val="1"/>
+          <w:numId w:val="24"/>
+        </w:numPr>
+      </w:pPr>
+      <w:r>
+        <w:t>Los valores financieros deben prorratearse según el porcentaje vendido.</w:t>
+      </w:r>
+    </w:p>
+    <w:p>
+      <w:pPr>
+        <w:numPr>
+          <w:ilvl w:val="1"/>
+          <w:numId w:val="24"/>
+        </w:numPr>
+      </w:pPr>
+      <w:r>
+        <w:t>Los estados de las cuotas deben copiarse desde las cuotas originales correspondientes.</w:t>
+      </w:r>
+    </w:p>
+    <w:p>
+      <w:pPr>
+        <w:numPr>
+          <w:ilvl w:val="0"/>
+          <w:numId w:val="24"/>
+        </w:numPr>
+      </w:pPr>
+      <w:r>
+        <w:t>Amortización de la Parte Remanente</w:t>
+      </w:r>
+    </w:p>
+    <w:p>
+      <w:pPr>
+        <w:numPr>
+          <w:ilvl w:val="1"/>
+          <w:numId w:val="24"/>
+        </w:numPr>
+      </w:pPr>
+      <w:r>
+        <w:t>Inicia desde la primera cuota de la inversión original.</w:t>
+      </w:r>
+    </w:p>
+    <w:p>
+      <w:pPr>
+        <w:numPr>
+          <w:ilvl w:val="1"/>
+          <w:numId w:val="24"/>
+        </w:numPr>
+      </w:pPr>
+      <w:r>
+        <w:t>Finaliza en la misma fecha de vencimiento de la inversión original.</w:t>
+      </w:r>
+    </w:p>
+    <w:p>
+      <w:pPr>
+        <w:numPr>
+          <w:ilvl w:val="1"/>
+          <w:numId w:val="24"/>
+        </w:numPr>
+      </w:pPr>
+      <w:r>
+        <w:t>Los valores financieros deben prorratearse según el porcentaje remanente.</w:t>
+      </w:r>
+    </w:p>
+    <w:p>
+      <w:pPr>
+        <w:numPr>
+          <w:ilvl w:val="1"/>
+          <w:numId w:val="24"/>
+        </w:numPr>
+      </w:pPr>
+      <w:r>
+        <w:lastRenderedPageBreak/>
+        <w:t>Los estados de las cuotas deben copiarse desde las cuotas originales correspondientes.</w:t>
+      </w:r>
+    </w:p>
+    <w:p>
+      <w:pPr>
+        <w:numPr>
+          <w:ilvl w:val="0"/>
+          <w:numId w:val="24"/>
+        </w:numPr>
+      </w:pPr>
+      <w:r>
+        <w:t>La suma de:</w:t>
+      </w:r>
+    </w:p>
+    <w:p>
+      <w:pPr>
+        <w:numPr>
+          <w:ilvl w:val="1"/>
+          <w:numId w:val="24"/>
+        </w:numPr>
+      </w:pPr>
+      <w:r>
+        <w:t>Amortización Parte Vendida</w:t>
+      </w:r>
+    </w:p>
+    <w:p>
+      <w:pPr>
+        <w:numPr>
+          <w:ilvl w:val="1"/>
+          <w:numId w:val="24"/>
+        </w:numPr>
+      </w:pPr>
+      <w:r>
+        <w:t>Amortización Parte Remanente</w:t>
+      </w:r>
+    </w:p>
+    <w:p>
+      <w:r>
+        <w:t>debe coincidir exactamente con la amortización original antes de la venta.</w:t>
+      </w:r>
+    </w:p>
+    <w:p>
+      <w:r>
+        <w:t>Objetivo:</w:t>
+      </w:r>
+    </w:p>
+    <w:p>
+      <w:r>
+        <w:t>Mantener trazabilidad completa de la inversión original y permitir reconstruir posteriormente el proceso completo de venta parcial sin perder información histórica.</w:t>
       </w:r>
     </w:p>
     <w:p/>
@@ -4545,6 +4807,123 @@
     </w:lvl>
   </w:abstractNum>
   <w:abstractNum w:abstractNumId="8" w15:restartNumberingAfterBreak="0">
+    <w:nsid w:val="360F0945"/>
+    <w:multiLevelType w:val="multilevel"/>
+    <w:tmpl w:val="97C26ED2"/>
+    <w:lvl w:ilvl="0">
+      <w:start w:val="1"/>
+      <w:numFmt w:val="decimal"/>
+      <w:lvlText w:val="%1."/>
+      <w:lvlJc w:val="left"/>
+      <w:pPr>
+        <w:tabs>
+          <w:tab w:val="num" w:pos="720"/>
+        </w:tabs>
+        <w:ind w:left="720" w:hanging="360"/>
+      </w:pPr>
+    </w:lvl>
+    <w:lvl w:ilvl="1">
+      <w:start w:val="1"/>
+      <w:numFmt w:val="bullet"/>
+      <w:lvlText w:val="o"/>
+      <w:lvlJc w:val="left"/>
+      <w:pPr>
+        <w:tabs>
+          <w:tab w:val="num" w:pos="1440"/>
+        </w:tabs>
+        <w:ind w:left="1440" w:hanging="360"/>
+      </w:pPr>
+      <w:rPr>
+        <w:rFonts w:ascii="Courier New" w:hAnsi="Courier New" w:hint="default"/>
+        <w:sz w:val="20"/>
+      </w:rPr>
+    </w:lvl>
+    <w:lvl w:ilvl="2" w:tentative="1">
+      <w:start w:val="1"/>
+      <w:numFmt w:val="decimal"/>
+      <w:lvlText w:val="%3."/>
+      <w:lvlJc w:val="left"/>
+      <w:pPr>
+        <w:tabs>
+          <w:tab w:val="num" w:pos="2160"/>
+        </w:tabs>
+        <w:ind w:left="2160" w:hanging="360"/>
+      </w:pPr>
+    </w:lvl>
+    <w:lvl w:ilvl="3" w:tentative="1">
+      <w:start w:val="1"/>
+      <w:numFmt w:val="decimal"/>
+      <w:lvlText w:val="%4."/>
+      <w:lvlJc w:val="left"/>
+      <w:pPr>
+        <w:tabs>
+          <w:tab w:val="num" w:pos="2880"/>
+        </w:tabs>
+        <w:ind w:left="2880" w:hanging="360"/>
+      </w:pPr>
+    </w:lvl>
+    <w:lvl w:ilvl="4" w:tentative="1">
+      <w:start w:val="1"/>
+      <w:numFmt w:val="decimal"/>
+      <w:lvlText w:val="%5."/>
+      <w:lvlJc w:val="left"/>
+      <w:pPr>
+        <w:tabs>
+          <w:tab w:val="num" w:pos="3600"/>
+        </w:tabs>
+        <w:ind w:left="3600" w:hanging="360"/>
+      </w:pPr>
+    </w:lvl>
+    <w:lvl w:ilvl="5" w:tentative="1">
+      <w:start w:val="1"/>
+      <w:numFmt w:val="decimal"/>
+      <w:lvlText w:val="%6."/>
+      <w:lvlJc w:val="left"/>
+      <w:pPr>
+        <w:tabs>
+          <w:tab w:val="num" w:pos="4320"/>
+        </w:tabs>
+        <w:ind w:left="4320" w:hanging="360"/>
+      </w:pPr>
+    </w:lvl>
+    <w:lvl w:ilvl="6" w:tentative="1">
+      <w:start w:val="1"/>
+      <w:numFmt w:val="decimal"/>
+      <w:lvlText w:val="%7."/>
+      <w:lvlJc w:val="left"/>
+      <w:pPr>
+        <w:tabs>
+          <w:tab w:val="num" w:pos="5040"/>
+        </w:tabs>
+        <w:ind w:left="5040" w:hanging="360"/>
+      </w:pPr>
+    </w:lvl>
+    <w:lvl w:ilvl="7" w:tentative="1">
+      <w:start w:val="1"/>
+      <w:numFmt w:val="decimal"/>
+      <w:lvlText w:val="%8."/>
+      <w:lvlJc w:val="left"/>
+      <w:pPr>
+        <w:tabs>
+          <w:tab w:val="num" w:pos="5760"/>
+        </w:tabs>
+        <w:ind w:left="5760" w:hanging="360"/>
+      </w:pPr>
+    </w:lvl>
+    <w:lvl w:ilvl="8" w:tentative="1">
+      <w:start w:val="1"/>
+      <w:numFmt w:val="decimal"/>
+      <w:lvlText w:val="%9."/>
+      <w:lvlJc w:val="left"/>
+      <w:pPr>
+        <w:tabs>
+          <w:tab w:val="num" w:pos="6480"/>
+        </w:tabs>
+        <w:ind w:left="6480" w:hanging="360"/>
+      </w:pPr>
+    </w:lvl>
+  </w:abstractNum>
+  <w:abstractNum w:abstractNumId="9" w15:restartNumberingAfterBreak="0">
     <w:nsid w:val="3944229B"/>
     <w:multiLevelType w:val="multilevel"/>
     <w:tmpl w:val="B16CF786"/>
@@ -4657,7 +5036,7 @@
       </w:pPr>
     </w:lvl>
   </w:abstractNum>
-  <w:abstractNum w:abstractNumId="9" w15:restartNumberingAfterBreak="0">
+  <w:abstractNum w:abstractNumId="10" w15:restartNumberingAfterBreak="0">
     <w:nsid w:val="3A325204"/>
     <w:multiLevelType w:val="multilevel"/>
     <w:tmpl w:val="580E67A2"/>
@@ -4806,7 +5185,7 @@
       </w:rPr>
     </w:lvl>
   </w:abstractNum>
-  <w:abstractNum w:abstractNumId="10" w15:restartNumberingAfterBreak="0">
+  <w:abstractNum w:abstractNumId="11" w15:restartNumberingAfterBreak="0">
     <w:nsid w:val="420D3563"/>
     <w:multiLevelType w:val="hybridMultilevel"/>
     <w:tmpl w:val="7A9AD9FA"/>
@@ -4895,7 +5274,7 @@
       </w:pPr>
     </w:lvl>
   </w:abstractNum>
-  <w:abstractNum w:abstractNumId="11" w15:restartNumberingAfterBreak="0">
+  <w:abstractNum w:abstractNumId="12" w15:restartNumberingAfterBreak="0">
     <w:nsid w:val="43F43239"/>
     <w:multiLevelType w:val="multilevel"/>
     <w:tmpl w:val="E18651F6"/>
@@ -5044,7 +5423,7 @@
       </w:rPr>
     </w:lvl>
   </w:abstractNum>
-  <w:abstractNum w:abstractNumId="12" w15:restartNumberingAfterBreak="0">
+  <w:abstractNum w:abstractNumId="13" w15:restartNumberingAfterBreak="0">
     <w:nsid w:val="442B6008"/>
     <w:multiLevelType w:val="multilevel"/>
     <w:tmpl w:val="7B060078"/>
@@ -5165,7 +5544,7 @@
       </w:rPr>
     </w:lvl>
   </w:abstractNum>
-  <w:abstractNum w:abstractNumId="13" w15:restartNumberingAfterBreak="0">
+  <w:abstractNum w:abstractNumId="14" w15:restartNumberingAfterBreak="0">
     <w:nsid w:val="4B0246CE"/>
     <w:multiLevelType w:val="multilevel"/>
     <w:tmpl w:val="7B060078"/>
@@ -5286,7 +5665,7 @@
       </w:rPr>
     </w:lvl>
   </w:abstractNum>
-  <w:abstractNum w:abstractNumId="14" w15:restartNumberingAfterBreak="0">
+  <w:abstractNum w:abstractNumId="15" w15:restartNumberingAfterBreak="0">
     <w:nsid w:val="536179BC"/>
     <w:multiLevelType w:val="hybridMultilevel"/>
     <w:tmpl w:val="D2940FD2"/>
@@ -5375,7 +5754,7 @@
       </w:pPr>
     </w:lvl>
   </w:abstractNum>
-  <w:abstractNum w:abstractNumId="15" w15:restartNumberingAfterBreak="0">
+  <w:abstractNum w:abstractNumId="16" w15:restartNumberingAfterBreak="0">
     <w:nsid w:val="53D018E9"/>
     <w:multiLevelType w:val="multilevel"/>
     <w:tmpl w:val="C082F168"/>
@@ -5461,7 +5840,7 @@
       </w:pPr>
     </w:lvl>
   </w:abstractNum>
-  <w:abstractNum w:abstractNumId="16" w15:restartNumberingAfterBreak="0">
+  <w:abstractNum w:abstractNumId="17" w15:restartNumberingAfterBreak="0">
     <w:nsid w:val="68997961"/>
     <w:multiLevelType w:val="multilevel"/>
     <w:tmpl w:val="A2EA5AD4"/>
@@ -5547,7 +5926,7 @@
       </w:pPr>
     </w:lvl>
   </w:abstractNum>
-  <w:abstractNum w:abstractNumId="17" w15:restartNumberingAfterBreak="0">
+  <w:abstractNum w:abstractNumId="18" w15:restartNumberingAfterBreak="0">
     <w:nsid w:val="6A2E2E53"/>
     <w:multiLevelType w:val="multilevel"/>
     <w:tmpl w:val="9990B534"/>
@@ -5633,7 +6012,7 @@
       </w:pPr>
     </w:lvl>
   </w:abstractNum>
-  <w:abstractNum w:abstractNumId="18" w15:restartNumberingAfterBreak="0">
+  <w:abstractNum w:abstractNumId="19" w15:restartNumberingAfterBreak="0">
     <w:nsid w:val="78AA5908"/>
     <w:multiLevelType w:val="multilevel"/>
     <w:tmpl w:val="8360722A"/>
@@ -5750,7 +6129,7 @@
       </w:pPr>
     </w:lvl>
   </w:abstractNum>
-  <w:abstractNum w:abstractNumId="19" w15:restartNumberingAfterBreak="0">
+  <w:abstractNum w:abstractNumId="20" w15:restartNumberingAfterBreak="0">
     <w:nsid w:val="7EC51709"/>
     <w:multiLevelType w:val="multilevel"/>
     <w:tmpl w:val="DDCA1952"/>
@@ -5899,7 +6278,7 @@
       </w:rPr>
     </w:lvl>
   </w:abstractNum>
-  <w:abstractNum w:abstractNumId="20" w15:restartNumberingAfterBreak="0">
+  <w:abstractNum w:abstractNumId="21" w15:restartNumberingAfterBreak="0">
     <w:nsid w:val="7F54117C"/>
     <w:multiLevelType w:val="hybridMultilevel"/>
     <w:tmpl w:val="21E833D2"/>
@@ -5989,7 +6368,7 @@
     </w:lvl>
   </w:abstractNum>
   <w:num w:numId="1" w16cid:durableId="1044669842">
-    <w:abstractNumId w:val="16"/>
+    <w:abstractNumId w:val="17"/>
   </w:num>
   <w:num w:numId="2" w16cid:durableId="751859171">
     <w:abstractNumId w:val="2"/>
@@ -5998,13 +6377,13 @@
     <w:abstractNumId w:val="5"/>
   </w:num>
   <w:num w:numId="4" w16cid:durableId="1537884721">
-    <w:abstractNumId w:val="17"/>
+    <w:abstractNumId w:val="18"/>
   </w:num>
   <w:num w:numId="5" w16cid:durableId="543714735">
-    <w:abstractNumId w:val="15"/>
+    <w:abstractNumId w:val="16"/>
   </w:num>
   <w:num w:numId="6" w16cid:durableId="962272814">
-    <w:abstractNumId w:val="8"/>
+    <w:abstractNumId w:val="9"/>
   </w:num>
   <w:num w:numId="7" w16cid:durableId="550650192">
     <w:abstractNumId w:val="3"/>
@@ -6019,25 +6398,25 @@
     <w:abstractNumId w:val="0"/>
   </w:num>
   <w:num w:numId="11" w16cid:durableId="1654986480">
-    <w:abstractNumId w:val="10"/>
+    <w:abstractNumId w:val="11"/>
   </w:num>
   <w:num w:numId="12" w16cid:durableId="404184929">
     <w:abstractNumId w:val="4"/>
   </w:num>
   <w:num w:numId="13" w16cid:durableId="486744397">
-    <w:abstractNumId w:val="13"/>
+    <w:abstractNumId w:val="14"/>
   </w:num>
   <w:num w:numId="14" w16cid:durableId="1084451739">
-    <w:abstractNumId w:val="14"/>
+    <w:abstractNumId w:val="15"/>
   </w:num>
   <w:num w:numId="15" w16cid:durableId="1414859458">
-    <w:abstractNumId w:val="12"/>
+    <w:abstractNumId w:val="13"/>
   </w:num>
   <w:num w:numId="16" w16cid:durableId="1595362445">
     <w:abstractNumId w:val="1"/>
   </w:num>
   <w:num w:numId="17" w16cid:durableId="98330891">
-    <w:abstractNumId w:val="20"/>
+    <w:abstractNumId w:val="21"/>
   </w:num>
   <w:num w:numId="18" w16cid:durableId="151607216">
     <w:abstractNumId w:val="6"/>
@@ -6046,16 +6425,19 @@
     <w:abstractNumId w:val="7"/>
   </w:num>
   <w:num w:numId="20" w16cid:durableId="611134232">
-    <w:abstractNumId w:val="18"/>
+    <w:abstractNumId w:val="19"/>
   </w:num>
   <w:num w:numId="21" w16cid:durableId="1882325273">
-    <w:abstractNumId w:val="19"/>
+    <w:abstractNumId w:val="20"/>
   </w:num>
   <w:num w:numId="22" w16cid:durableId="608198286">
-    <w:abstractNumId w:val="9"/>
+    <w:abstractNumId w:val="10"/>
   </w:num>
   <w:num w:numId="23" w16cid:durableId="1325205009">
-    <w:abstractNumId w:val="11"/>
+    <w:abstractNumId w:val="12"/>
+  </w:num>
+  <w:num w:numId="24" w16cid:durableId="1945309371">
+    <w:abstractNumId w:val="8"/>
   </w:num>
 </w:numbering>
 </file>

</xml_diff>